<commit_message>
chore(plantillas): quitar huecos de firma manuscrita en DOCX; firma vía PDF/tramitador
Made-with: Cursor
</commit_message>
<xml_diff>
--- a/backend/plantillas/docx/01_mtps_adjudicacion_denuncia.docx
+++ b/backend/plantillas/docx/01_mtps_adjudicacion_denuncia.docx
@@ -52,46 +52,6 @@
         <w:t xml:space="preserve">Audiencia fijada: {{FECHA_AUDIENCIA}}</w:t>
       </w:r>
     </w:p>
-    <w:p>
-      <w:r>
-        <w:t xml:space="preserve"/>
-      </w:r>
-    </w:p>
-    <w:p>
-      <w:r>
-        <w:t xml:space="preserve">_________________________</w:t>
-      </w:r>
-    </w:p>
-    <w:p>
-      <w:r>
-        <w:t xml:space="preserve">F. {{FIRMA_PARTE_ACTORA}}  → rol sistema: parte_actora</w:t>
-      </w:r>
-    </w:p>
-    <w:p>
-      <w:r>
-        <w:t xml:space="preserve">PARTE DENUNCIANTE / COMPARECIENTE</w:t>
-      </w:r>
-    </w:p>
-    <w:p>
-      <w:r>
-        <w:t xml:space="preserve"/>
-      </w:r>
-    </w:p>
-    <w:p>
-      <w:r>
-        <w:t xml:space="preserve">_________________________</w:t>
-      </w:r>
-    </w:p>
-    <w:p>
-      <w:r>
-        <w:t xml:space="preserve">F. {{FIRMA_INSPECTORA_TRABAJO}}  → rol sistema: inspectora_trabajo</w:t>
-      </w:r>
-    </w:p>
-    <w:p>
-      <w:r>
-        <w:t xml:space="preserve">INSPECTORA DE TRABAJO — MTPS</w:t>
-      </w:r>
-    </w:p>
     <w:sectPr>
       <w:pgSz w:w="12240" w:h="15840"/>
       <w:pgMar w:top="1440" w:right="1440" w:bottom="1440" w:left="1440"/>

</xml_diff>

<commit_message>
chore: PDF maestro + LISTA_PARTES; plantillas con meta tipo/roles y TIPOS_ORDEN
Made-with: Cursor
</commit_message>
<xml_diff>
--- a/backend/plantillas/docx/01_mtps_adjudicacion_denuncia.docx
+++ b/backend/plantillas/docx/01_mtps_adjudicacion_denuncia.docx
@@ -2,6 +2,16 @@
 <file path=word/document.xml><?xml version="1.0" encoding="utf-8"?>
 <w:document xmlns:w="http://schemas.openxmlformats.org/wordprocessingml/2006/main">
   <w:body>
+    <w:p>
+      <w:r>
+        <w:t xml:space="preserve">[Expedientes OJ — tramitador] tipo_documento_oj: mtps_adjudicacion_denuncia | roles sugeridos al firmar: parte_actora, inspectora_trabajo</w:t>
+      </w:r>
+    </w:p>
+    <w:p>
+      <w:r>
+        <w:t xml:space="preserve"/>
+      </w:r>
+    </w:p>
     <w:p>
       <w:r>
         <w:t xml:space="preserve">PLANTILLA — Adjudicación / acta inicial de denuncia (Inspección de Trabajo)</w:t>

</xml_diff>